<commit_message>
feat(marca): recria logo Aluizio Pires Educacao e aplica nos Word e no site
- scripts/gerar_logo_aluizio.py: recria a logo (livro aberto + wordmark) com
  Pillow, em versoes preta/branca e completa/emblema; fonte Questrial (OFL) incluida.
- brand/: assets da logo (png transparente, 4 variantes).
- Word: cabecalho de marca compartilhado (papel-timbrado com logo centralizada),
  eliminando a duplicacao do header nos 3 scripts (achado da revisao de codigo);
  rodape atualizado para 'Aluizio Pires - Educacao'.
- onu-site: emblema branco na barra, logo completa no heroi, favicon; rodape e
  descricao atualizados.
- docx regenerados com a logo embutida.

https://claude.ai/code/session_01NFpSHNThGdd13WKUzQU8Jf
</commit_message>
<xml_diff>
--- a/docs/cursos/Caderno_Delegado_MUN_AluizioEducacao.docx
+++ b/docs/cursos/Caderno_Delegado_MUN_AluizioEducacao.docx
@@ -17,116 +17,86 @@
         </w:tblBorders>
       </w:tblPr>
       <w:tblGrid>
-        <w:gridCol w:w="5040"/>
-        <w:gridCol w:w="5040"/>
+        <w:gridCol w:w="10080"/>
       </w:tblGrid>
       <w:tr>
         <w:tc>
           <w:tcPr>
-            <w:tcW w:type="dxa" w:w="5803"/>
-            <w:shd w:val="clear" w:color="auto" w:fill="1B2A4A"/>
+            <w:tcW w:type="dxa" w:w="9360"/>
             <w:tcMar>
-              <w:top w:w="140" w:type="dxa"/>
-              <w:bottom w:w="140" w:type="dxa"/>
-              <w:start w:w="200" w:type="dxa"/>
-              <w:end w:w="120" w:type="dxa"/>
-              <w:left w:w="200" w:type="dxa"/>
-              <w:right w:w="120" w:type="dxa"/>
+              <w:top w:w="30" w:type="dxa"/>
+              <w:bottom w:w="40" w:type="dxa"/>
+              <w:start w:w="0" w:type="dxa"/>
+              <w:end w:w="0" w:type="dxa"/>
+              <w:left w:w="0" w:type="dxa"/>
+              <w:right w:w="0" w:type="dxa"/>
             </w:tcMar>
-            <w:vAlign w:val="center"/>
           </w:tcPr>
           <w:p>
             <w:pPr>
               <w:spacing w:before="0" w:after="0" w:line="240" w:lineRule="auto"/>
+              <w:jc w:val="center"/>
             </w:pPr>
             <w:r/>
             <w:r>
-              <w:rPr>
-                <w:rFonts w:ascii="Georgia" w:hAnsi="Georgia"/>
-                <w:b/>
-                <w:i w:val="0"/>
-                <w:color w:val="FFFFFF"/>
-                <w:sz w:val="44"/>
-              </w:rPr>
-              <w:t>Aluizio</w:t>
-            </w:r>
-            <w:r>
-              <w:rPr>
-                <w:rFonts w:ascii="Georgia" w:hAnsi="Georgia"/>
-                <w:b/>
-                <w:i w:val="0"/>
-                <w:color w:val="C9A227"/>
-                <w:sz w:val="44"/>
-              </w:rPr>
-              <w:t xml:space="preserve">  Educação</w:t>
+              <w:drawing>
+                <wp:inline xmlns:a="http://schemas.openxmlformats.org/drawingml/2006/main" xmlns:pic="http://schemas.openxmlformats.org/drawingml/2006/picture">
+                  <wp:extent cx="878900" cy="786384"/>
+                  <wp:docPr id="1" name="Picture 1"/>
+                  <wp:cNvGraphicFramePr>
+                    <a:graphicFrameLocks noChangeAspect="1"/>
+                  </wp:cNvGraphicFramePr>
+                  <a:graphic>
+                    <a:graphicData uri="http://schemas.openxmlformats.org/drawingml/2006/picture">
+                      <pic:pic>
+                        <pic:nvPicPr>
+                          <pic:cNvPr id="0" name="aluizio-logo-black.png"/>
+                          <pic:cNvPicPr/>
+                        </pic:nvPicPr>
+                        <pic:blipFill>
+                          <a:blip r:embed="rId9"/>
+                          <a:stretch>
+                            <a:fillRect/>
+                          </a:stretch>
+                        </pic:blipFill>
+                        <pic:spPr>
+                          <a:xfrm>
+                            <a:off x="0" y="0"/>
+                            <a:ext cx="878900" cy="786384"/>
+                          </a:xfrm>
+                          <a:prstGeom prst="rect"/>
+                        </pic:spPr>
+                      </pic:pic>
+                    </a:graphicData>
+                  </a:graphic>
+                </wp:inline>
+              </w:drawing>
             </w:r>
           </w:p>
           <w:p>
             <w:pPr>
-              <w:spacing w:before="40" w:after="0" w:line="240" w:lineRule="auto"/>
+              <w:spacing w:before="120" w:after="0" w:line="240" w:lineRule="auto"/>
+              <w:jc w:val="center"/>
             </w:pPr>
-            <w:r>
-              <w:rPr>
-                <w:rFonts w:ascii="Calibri" w:hAnsi="Calibri"/>
-                <w:b w:val="0"/>
-                <w:i/>
-                <w:color w:val="C7D0E0"/>
-                <w:sz w:val="18"/>
-              </w:rPr>
-              <w:t>Mentoria &amp; preparação acadêmica</w:t>
-            </w:r>
-          </w:p>
-        </w:tc>
-        <w:tc>
-          <w:tcPr>
-            <w:tcW w:type="dxa" w:w="3557"/>
-            <w:shd w:val="clear" w:color="auto" w:fill="1B2A4A"/>
-            <w:tcMar>
-              <w:top w:w="140" w:type="dxa"/>
-              <w:bottom w:w="140" w:type="dxa"/>
-              <w:start w:w="120" w:type="dxa"/>
-              <w:end w:w="200" w:type="dxa"/>
-              <w:left w:w="120" w:type="dxa"/>
-              <w:right w:w="200" w:type="dxa"/>
-            </w:tcMar>
-            <w:vAlign w:val="center"/>
-          </w:tcPr>
-          <w:p>
-            <w:pPr>
-              <w:spacing w:before="0" w:after="0" w:line="240" w:lineRule="auto"/>
-              <w:jc w:val="right"/>
-            </w:pPr>
-            <w:r/>
             <w:r>
               <w:rPr>
                 <w:rFonts w:ascii="Calibri" w:hAnsi="Calibri"/>
                 <w:b/>
                 <w:i w:val="0"/>
                 <w:color w:val="C9A227"/>
-                <w:sz w:val="20"/>
+                <w:sz w:val="17"/>
               </w:rPr>
-              <w:t>CADERNO DO DELEGADO</w:t>
-            </w:r>
-          </w:p>
-          <w:p>
-            <w:pPr>
-              <w:spacing w:before="40" w:after="0" w:line="240" w:lineRule="auto"/>
-              <w:jc w:val="right"/>
-            </w:pPr>
-            <w:r>
-              <w:rPr>
-                <w:rFonts w:ascii="Calibri" w:hAnsi="Calibri"/>
-                <w:b w:val="0"/>
-                <w:i w:val="0"/>
-                <w:color w:val="C7D0E0"/>
-                <w:sz w:val="18"/>
-              </w:rPr>
-              <w:t>Model UN · material de trabalho</w:t>
+              <w:t>CADERNO DO DELEGADO · MODEL UN</w:t>
             </w:r>
           </w:p>
         </w:tc>
       </w:tr>
     </w:tbl>
+    <w:p>
+      <w:pPr>
+        <w:spacing w:after="40"/>
+      </w:pPr>
+    </w:p>
     <w:p>
       <w:pPr>
         <w:spacing w:before="280" w:after="0" w:line="252" w:lineRule="auto"/>
@@ -5968,7 +5938,7 @@
       </w:pPr>
     </w:p>
     <w:sectPr>
-      <w:footerReference w:type="default" r:id="rId9"/>
+      <w:footerReference w:type="default" r:id="rId10"/>
       <w:pgSz w:w="12240" w:h="15840"/>
       <w:pgMar w:top="864" w:right="1080" w:bottom="1008" w:left="1080" w:header="720" w:footer="720" w:gutter="0"/>
       <w:cols w:space="720"/>
@@ -5993,7 +5963,7 @@
         <w:color w:val="9AA3B2"/>
         <w:sz w:val="16"/>
       </w:rPr>
-      <w:t xml:space="preserve">Aluizio Educação  ·  [e-mail]  ·  [telefone/WhatsApp]  ·  [site]   —   página </w:t>
+      <w:t xml:space="preserve">Aluizio Pires · Educação  ·  [e-mail]  ·  [telefone/WhatsApp]  ·  [site]   —   página </w:t>
     </w:r>
     <w:fldSimple w:instr="PAGE">
       <w:r>

</xml_diff>